<commit_message>
Deprecate repository - redirect to is4010-course
</commit_message>
<xml_diff>
--- a/README.docx
+++ b/README.docx
@@ -2,7 +2,7 @@
 <file path=word/document.xml><?xml version="1.0" encoding="utf-8"?>
 <w:document xmlns:w="http://schemas.openxmlformats.org/wordprocessingml/2006/main" xmlns:m="http://schemas.openxmlformats.org/officeDocument/2006/math" xmlns:r="http://schemas.openxmlformats.org/officeDocument/2006/relationships" xmlns:o="urn:schemas-microsoft-com:office:office" xmlns:v="urn:schemas-microsoft-com:vml" xmlns:w10="urn:schemas-microsoft-com:office:word" xmlns:a="http://schemas.openxmlformats.org/drawingml/2006/main" xmlns:pic="http://schemas.openxmlformats.org/drawingml/2006/picture" xmlns:wp="http://schemas.openxmlformats.org/drawingml/2006/wordprocessingDrawing">
   <w:body>
-    <w:bookmarkStart w:id="148" w:name="Xdb927b6e511be24490f243e53ae09998f4e625f"/>
+    <w:bookmarkStart w:id="163" w:name="Xdb927b6e511be24490f243e53ae09998f4e625f"/>
     <w:p>
       <w:pPr>
         <w:pStyle w:val="Heading1"/>
@@ -511,7 +511,7 @@
       </w:r>
     </w:p>
     <w:bookmarkEnd w:id="25"/>
-    <w:bookmarkStart w:id="96" w:name="course-roadmap"/>
+    <w:bookmarkStart w:id="111" w:name="course-roadmap"/>
     <w:p>
       <w:pPr>
         <w:pStyle w:val="Heading2"/>
@@ -2448,13 +2448,13 @@
       </w:r>
     </w:p>
     <w:bookmarkEnd w:id="84"/>
-    <w:bookmarkStart w:id="92" w:name="week-12-generics-traits-and-testing"/>
+    <w:bookmarkStart w:id="92" w:name="week-12-generics-and-traits"/>
     <w:p>
       <w:pPr>
         <w:pStyle w:val="Heading3"/>
       </w:pPr>
       <w:r>
-        <w:t xml:space="preserve">Week 12: Generics, Traits, and Testing</w:t>
+        <w:t xml:space="preserve">Week 12: Generics and Traits</w:t>
       </w:r>
     </w:p>
     <w:p>
@@ -2462,7 +2462,7 @@
         <w:pStyle w:val="FirstParagraph"/>
       </w:pPr>
       <w:r>
-        <w:t xml:space="preserve">Generic types, trait system, and test-driven development</w:t>
+        <w:t xml:space="preserve">Generic types, trait system, and polymorphism in Rust</w:t>
       </w:r>
     </w:p>
     <w:p>
@@ -2487,7 +2487,7 @@
           <w:rPr>
             <w:rStyle w:val="Hyperlink"/>
           </w:rPr>
-          <w:t xml:space="preserve">Week 12: Generics, Traits, and Testing</w:t>
+          <w:t xml:space="preserve">Week 12: Generics and Traits</w:t>
         </w:r>
       </w:hyperlink>
     </w:p>
@@ -2513,7 +2513,7 @@
           <w:rPr>
             <w:rStyle w:val="Hyperlink"/>
           </w:rPr>
-          <w:t xml:space="preserve">Lab 12: Generic Stack with TDD</w:t>
+          <w:t xml:space="preserve">Lab 12: Generic Stack Implementation</w:t>
         </w:r>
       </w:hyperlink>
     </w:p>
@@ -2565,7 +2565,7 @@
           <w:rPr>
             <w:rStyle w:val="Hyperlink"/>
           </w:rPr>
-          <w:t xml:space="preserve">Week 12: Generics, Traits, and Testing</w:t>
+          <w:t xml:space="preserve">Week 12: Generics and Traits</w:t>
         </w:r>
       </w:hyperlink>
     </w:p>
@@ -2614,7 +2614,7 @@
           <w:rPr>
             <w:rStyle w:val="Hyperlink"/>
           </w:rPr>
-          <w:t xml:space="preserve">Writing Automated Tests</w:t>
+          <w:t xml:space="preserve">Advanced Traits</w:t>
         </w:r>
       </w:hyperlink>
       <w:r>
@@ -2631,7 +2631,7 @@
           <w:rPr>
             <w:rStyle w:val="Hyperlink"/>
           </w:rPr>
-          <w:t xml:space="preserve">Advanced Traits</w:t>
+          <w:t xml:space="preserve">Trait Objects</w:t>
         </w:r>
       </w:hyperlink>
     </w:p>
@@ -2643,13 +2643,13 @@
       </w:r>
     </w:p>
     <w:bookmarkEnd w:id="92"/>
-    <w:bookmarkStart w:id="93" w:name="week-13-final-project-workshop"/>
+    <w:bookmarkStart w:id="100" w:name="week-13-testing-and-packaging"/>
     <w:p>
       <w:pPr>
         <w:pStyle w:val="Heading3"/>
       </w:pPr>
       <w:r>
-        <w:t xml:space="preserve">Week 13: Final Project Workshop</w:t>
+        <w:t xml:space="preserve">Week 13: Testing and Packaging</w:t>
       </w:r>
     </w:p>
     <w:p>
@@ -2657,7 +2657,7 @@
         <w:pStyle w:val="FirstParagraph"/>
       </w:pPr>
       <w:r>
-        <w:t xml:space="preserve">Collaborative work session and MVP check-ins</w:t>
+        <w:t xml:space="preserve">Test-driven development, error handling, and building production-ready Rust applications</w:t>
       </w:r>
     </w:p>
     <w:p>
@@ -2669,11 +2669,22 @@
           <w:b/>
           <w:bCs/>
         </w:rPr>
-        <w:t xml:space="preserve">Project Work</w:t>
-      </w:r>
-      <w:r>
-        <w:t xml:space="preserve">: Focus on building your final application</w:t>
-      </w:r>
+        <w:t xml:space="preserve">Slides</w:t>
+      </w:r>
+      <w:r>
+        <w:t xml:space="preserve">:</w:t>
+      </w:r>
+      <w:r>
+        <w:t xml:space="preserve"> </w:t>
+      </w:r>
+      <w:hyperlink r:id="rId93">
+        <w:r>
+          <w:rPr>
+            <w:rStyle w:val="Hyperlink"/>
+          </w:rPr>
+          <w:t xml:space="preserve">Week 13: Testing and Packaging</w:t>
+        </w:r>
+      </w:hyperlink>
     </w:p>
     <w:p>
       <w:pPr>
@@ -2684,7 +2695,7 @@
           <w:b/>
           <w:bCs/>
         </w:rPr>
-        <w:t xml:space="preserve">Additional Resources</w:t>
+        <w:t xml:space="preserve">Lab</w:t>
       </w:r>
       <w:r>
         <w:t xml:space="preserve">:</w:t>
@@ -2697,8 +2708,143 @@
           <w:i/>
           <w:iCs/>
         </w:rPr>
-        <w:t xml:space="preserve">Coming soon</w:t>
-      </w:r>
+        <w:t xml:space="preserve">Work session - apply testing and packaging to your final project</w:t>
+      </w:r>
+    </w:p>
+    <w:p>
+      <w:pPr>
+        <w:pStyle w:val="BodyText"/>
+      </w:pPr>
+      <w:r>
+        <w:rPr>
+          <w:b/>
+          <w:bCs/>
+        </w:rPr>
+        <w:t xml:space="preserve">Interactive Exercises</w:t>
+      </w:r>
+      <w:r>
+        <w:t xml:space="preserve">:</w:t>
+      </w:r>
+      <w:r>
+        <w:t xml:space="preserve"> </w:t>
+      </w:r>
+      <w:hyperlink r:id="rId94">
+        <w:r>
+          <w:rPr>
+            <w:rStyle w:val="Hyperlink"/>
+          </w:rPr>
+          <w:t xml:space="preserve">Testing &amp; Packaging Exercises</w:t>
+        </w:r>
+      </w:hyperlink>
+    </w:p>
+    <w:p>
+      <w:pPr>
+        <w:pStyle w:val="BodyText"/>
+      </w:pPr>
+      <w:r>
+        <w:rPr>
+          <w:b/>
+          <w:bCs/>
+        </w:rPr>
+        <w:t xml:space="preserve">Lecture Notes</w:t>
+      </w:r>
+      <w:r>
+        <w:t xml:space="preserve">:</w:t>
+      </w:r>
+      <w:r>
+        <w:t xml:space="preserve"> </w:t>
+      </w:r>
+      <w:hyperlink r:id="rId95">
+        <w:r>
+          <w:rPr>
+            <w:rStyle w:val="Hyperlink"/>
+          </w:rPr>
+          <w:t xml:space="preserve">Week 13: Testing and Packaging</w:t>
+        </w:r>
+      </w:hyperlink>
+    </w:p>
+    <w:p>
+      <w:pPr>
+        <w:pStyle w:val="BodyText"/>
+      </w:pPr>
+      <w:r>
+        <w:rPr>
+          <w:b/>
+          <w:bCs/>
+        </w:rPr>
+        <w:t xml:space="preserve">Additional Resources</w:t>
+      </w:r>
+      <w:r>
+        <w:t xml:space="preserve">:</w:t>
+      </w:r>
+      <w:r>
+        <w:t xml:space="preserve"> </w:t>
+      </w:r>
+      <w:r>
+        <w:t xml:space="preserve">-</w:t>
+      </w:r>
+      <w:r>
+        <w:t xml:space="preserve"> </w:t>
+      </w:r>
+      <w:hyperlink r:id="rId96">
+        <w:r>
+          <w:rPr>
+            <w:rStyle w:val="Hyperlink"/>
+          </w:rPr>
+          <w:t xml:space="preserve">Writing Automated Tests</w:t>
+        </w:r>
+      </w:hyperlink>
+      <w:r>
+        <w:t xml:space="preserve"> </w:t>
+      </w:r>
+      <w:r>
+        <w:t xml:space="preserve">-</w:t>
+      </w:r>
+      <w:r>
+        <w:t xml:space="preserve"> </w:t>
+      </w:r>
+      <w:hyperlink r:id="rId97">
+        <w:r>
+          <w:rPr>
+            <w:rStyle w:val="Hyperlink"/>
+          </w:rPr>
+          <w:t xml:space="preserve">Error Handling</w:t>
+        </w:r>
+      </w:hyperlink>
+      <w:r>
+        <w:t xml:space="preserve"> </w:t>
+      </w:r>
+      <w:r>
+        <w:t xml:space="preserve">-</w:t>
+      </w:r>
+      <w:r>
+        <w:t xml:space="preserve"> </w:t>
+      </w:r>
+      <w:hyperlink r:id="rId98">
+        <w:r>
+          <w:rPr>
+            <w:rStyle w:val="Hyperlink"/>
+          </w:rPr>
+          <w:t xml:space="preserve">The Cargo Book</w:t>
+        </w:r>
+      </w:hyperlink>
+      <w:r>
+        <w:t xml:space="preserve"> </w:t>
+      </w:r>
+      <w:r>
+        <w:t xml:space="preserve">-</w:t>
+      </w:r>
+      <w:r>
+        <w:t xml:space="preserve"> </w:t>
+      </w:r>
+      <w:hyperlink r:id="rId99">
+        <w:r>
+          <w:rPr>
+            <w:rStyle w:val="Hyperlink"/>
+          </w:rPr>
+          <w:t xml:space="preserve">Command Line Apps in Rust</w:t>
+        </w:r>
+      </w:hyperlink>
     </w:p>
     <w:p>
       <w:r>
@@ -2707,14 +2853,14 @@
         </w:pict>
       </w:r>
     </w:p>
-    <w:bookmarkEnd w:id="93"/>
-    <w:bookmarkStart w:id="94" w:name="week-14-final-project-polish"/>
+    <w:bookmarkEnd w:id="100"/>
+    <w:bookmarkStart w:id="109" w:name="week-14-publishing-and-distribution"/>
     <w:p>
       <w:pPr>
         <w:pStyle w:val="Heading3"/>
       </w:pPr>
       <w:r>
-        <w:t xml:space="preserve">Week 14: Final Project Polish</w:t>
+        <w:t xml:space="preserve">Week 14: Publishing and Distribution</w:t>
       </w:r>
     </w:p>
     <w:p>
@@ -2722,7 +2868,7 @@
         <w:pStyle w:val="FirstParagraph"/>
       </w:pPr>
       <w:r>
-        <w:t xml:space="preserve">Presentation dry-runs and peer feedback</w:t>
+        <w:t xml:space="preserve">Semantic versioning, crates.io publishing, GitHub releases, and multi-platform distribution</w:t>
       </w:r>
     </w:p>
     <w:p>
@@ -2734,11 +2880,22 @@
           <w:b/>
           <w:bCs/>
         </w:rPr>
-        <w:t xml:space="preserve">Project Work</w:t>
-      </w:r>
-      <w:r>
-        <w:t xml:space="preserve">: Refine and prepare presentations</w:t>
-      </w:r>
+        <w:t xml:space="preserve">Slides</w:t>
+      </w:r>
+      <w:r>
+        <w:t xml:space="preserve">:</w:t>
+      </w:r>
+      <w:r>
+        <w:t xml:space="preserve"> </w:t>
+      </w:r>
+      <w:hyperlink r:id="rId101">
+        <w:r>
+          <w:rPr>
+            <w:rStyle w:val="Hyperlink"/>
+          </w:rPr>
+          <w:t xml:space="preserve">Week 14: Publishing and Distribution</w:t>
+        </w:r>
+      </w:hyperlink>
     </w:p>
     <w:p>
       <w:pPr>
@@ -2749,7 +2906,7 @@
           <w:b/>
           <w:bCs/>
         </w:rPr>
-        <w:t xml:space="preserve">Additional Resources</w:t>
+        <w:t xml:space="preserve">Lab</w:t>
       </w:r>
       <w:r>
         <w:t xml:space="preserve">:</w:t>
@@ -2762,8 +2919,160 @@
           <w:i/>
           <w:iCs/>
         </w:rPr>
-        <w:t xml:space="preserve">Coming soon</w:t>
-      </w:r>
+        <w:t xml:space="preserve">Work session - publish and distribute your final project</w:t>
+      </w:r>
+    </w:p>
+    <w:p>
+      <w:pPr>
+        <w:pStyle w:val="BodyText"/>
+      </w:pPr>
+      <w:r>
+        <w:rPr>
+          <w:b/>
+          <w:bCs/>
+        </w:rPr>
+        <w:t xml:space="preserve">Interactive Exercises</w:t>
+      </w:r>
+      <w:r>
+        <w:t xml:space="preserve">:</w:t>
+      </w:r>
+      <w:r>
+        <w:t xml:space="preserve"> </w:t>
+      </w:r>
+      <w:hyperlink r:id="rId102">
+        <w:r>
+          <w:rPr>
+            <w:rStyle w:val="Hyperlink"/>
+          </w:rPr>
+          <w:t xml:space="preserve">Publishing &amp; Distribution Exercises</w:t>
+        </w:r>
+      </w:hyperlink>
+    </w:p>
+    <w:p>
+      <w:pPr>
+        <w:pStyle w:val="BodyText"/>
+      </w:pPr>
+      <w:r>
+        <w:rPr>
+          <w:b/>
+          <w:bCs/>
+        </w:rPr>
+        <w:t xml:space="preserve">Lecture Notes</w:t>
+      </w:r>
+      <w:r>
+        <w:t xml:space="preserve">:</w:t>
+      </w:r>
+      <w:r>
+        <w:t xml:space="preserve"> </w:t>
+      </w:r>
+      <w:hyperlink r:id="rId103">
+        <w:r>
+          <w:rPr>
+            <w:rStyle w:val="Hyperlink"/>
+          </w:rPr>
+          <w:t xml:space="preserve">Week 14: Publishing and Distribution</w:t>
+        </w:r>
+      </w:hyperlink>
+    </w:p>
+    <w:p>
+      <w:pPr>
+        <w:pStyle w:val="BodyText"/>
+      </w:pPr>
+      <w:r>
+        <w:rPr>
+          <w:b/>
+          <w:bCs/>
+        </w:rPr>
+        <w:t xml:space="preserve">Additional Resources</w:t>
+      </w:r>
+      <w:r>
+        <w:t xml:space="preserve">:</w:t>
+      </w:r>
+      <w:r>
+        <w:t xml:space="preserve"> </w:t>
+      </w:r>
+      <w:r>
+        <w:t xml:space="preserve">-</w:t>
+      </w:r>
+      <w:r>
+        <w:t xml:space="preserve"> </w:t>
+      </w:r>
+      <w:hyperlink r:id="rId104">
+        <w:r>
+          <w:rPr>
+            <w:rStyle w:val="Hyperlink"/>
+          </w:rPr>
+          <w:t xml:space="preserve">Publishing on crates.io</w:t>
+        </w:r>
+      </w:hyperlink>
+      <w:r>
+        <w:t xml:space="preserve"> </w:t>
+      </w:r>
+      <w:r>
+        <w:t xml:space="preserve">-</w:t>
+      </w:r>
+      <w:r>
+        <w:t xml:space="preserve"> </w:t>
+      </w:r>
+      <w:hyperlink r:id="rId105">
+        <w:r>
+          <w:rPr>
+            <w:rStyle w:val="Hyperlink"/>
+          </w:rPr>
+          <w:t xml:space="preserve">Semantic Versioning</w:t>
+        </w:r>
+      </w:hyperlink>
+      <w:r>
+        <w:t xml:space="preserve"> </w:t>
+      </w:r>
+      <w:r>
+        <w:t xml:space="preserve">-</w:t>
+      </w:r>
+      <w:r>
+        <w:t xml:space="preserve"> </w:t>
+      </w:r>
+      <w:hyperlink r:id="rId106">
+        <w:r>
+          <w:rPr>
+            <w:rStyle w:val="Hyperlink"/>
+          </w:rPr>
+          <w:t xml:space="preserve">GitHub Releases</w:t>
+        </w:r>
+      </w:hyperlink>
+      <w:r>
+        <w:t xml:space="preserve"> </w:t>
+      </w:r>
+      <w:r>
+        <w:t xml:space="preserve">-</w:t>
+      </w:r>
+      <w:r>
+        <w:t xml:space="preserve"> </w:t>
+      </w:r>
+      <w:hyperlink r:id="rId107">
+        <w:r>
+          <w:rPr>
+            <w:rStyle w:val="Hyperlink"/>
+          </w:rPr>
+          <w:t xml:space="preserve">GitHub Actions for Rust</w:t>
+        </w:r>
+      </w:hyperlink>
+      <w:r>
+        <w:t xml:space="preserve"> </w:t>
+      </w:r>
+      <w:r>
+        <w:t xml:space="preserve">-</w:t>
+      </w:r>
+      <w:r>
+        <w:t xml:space="preserve"> </w:t>
+      </w:r>
+      <w:hyperlink r:id="rId108">
+        <w:r>
+          <w:rPr>
+            <w:rStyle w:val="Hyperlink"/>
+          </w:rPr>
+          <w:t xml:space="preserve">Homebrew Formula Cookbook</w:t>
+        </w:r>
+      </w:hyperlink>
     </w:p>
     <w:p>
       <w:r>
@@ -2772,8 +3081,8 @@
         </w:pict>
       </w:r>
     </w:p>
-    <w:bookmarkEnd w:id="94"/>
-    <w:bookmarkStart w:id="95" w:name="exam-week-demo-day"/>
+    <w:bookmarkEnd w:id="109"/>
+    <w:bookmarkStart w:id="110" w:name="exam-week-demo-day"/>
     <w:p>
       <w:pPr>
         <w:pStyle w:val="Heading3"/>
@@ -2797,9 +3106,9 @@
         </w:pict>
       </w:r>
     </w:p>
-    <w:bookmarkEnd w:id="95"/>
-    <w:bookmarkEnd w:id="96"/>
-    <w:bookmarkStart w:id="108" w:name="working-with-course-materials"/>
+    <w:bookmarkEnd w:id="110"/>
+    <w:bookmarkEnd w:id="111"/>
+    <w:bookmarkStart w:id="123" w:name="working-with-course-materials"/>
     <w:p>
       <w:pPr>
         <w:pStyle w:val="Heading2"/>
@@ -2898,7 +3207,7 @@
         <w:t xml:space="preserve">- Comprehensive written guides with examples and explanations</w:t>
       </w:r>
     </w:p>
-    <w:bookmarkStart w:id="100" w:name="how-these-materials-work-together"/>
+    <w:bookmarkStart w:id="115" w:name="how-these-materials-work-together"/>
     <w:p>
       <w:pPr>
         <w:pStyle w:val="Heading3"/>
@@ -2982,7 +3291,7 @@
         <w:t xml:space="preserve">: Each format leverages its unique advantages</w:t>
       </w:r>
     </w:p>
-    <w:bookmarkStart w:id="97" w:name="lecture-slides-.qmd-html"/>
+    <w:bookmarkStart w:id="112" w:name="lecture-slides-.qmd-html"/>
     <w:p>
       <w:pPr>
         <w:pStyle w:val="Heading4"/>
@@ -3027,8 +3336,8 @@
         <w:t xml:space="preserve">Historical context and real-world examples</w:t>
       </w:r>
     </w:p>
-    <w:bookmarkEnd w:id="97"/>
-    <w:bookmarkStart w:id="98" w:name="interactive-notebooks-.ipynb"/>
+    <w:bookmarkEnd w:id="112"/>
+    <w:bookmarkStart w:id="113" w:name="interactive-notebooks-.ipynb"/>
     <w:p>
       <w:pPr>
         <w:pStyle w:val="Heading4"/>
@@ -3113,8 +3422,8 @@
         <w:t xml:space="preserve">: Patterns you’ll use in assignments</w:t>
       </w:r>
     </w:p>
-    <w:bookmarkEnd w:id="98"/>
-    <w:bookmarkStart w:id="99" w:name="lecture-notes-.md"/>
+    <w:bookmarkEnd w:id="113"/>
+    <w:bookmarkStart w:id="114" w:name="lecture-notes-.md"/>
     <w:p>
       <w:pPr>
         <w:pStyle w:val="Heading4"/>
@@ -3199,9 +3508,9 @@
         <w:t xml:space="preserve">: Industry applications and interview prep</w:t>
       </w:r>
     </w:p>
-    <w:bookmarkEnd w:id="99"/>
-    <w:bookmarkEnd w:id="100"/>
-    <w:bookmarkStart w:id="101" w:name="recommended-workflow"/>
+    <w:bookmarkEnd w:id="114"/>
+    <w:bookmarkEnd w:id="115"/>
+    <w:bookmarkStart w:id="116" w:name="recommended-workflow"/>
     <w:p>
       <w:pPr>
         <w:pStyle w:val="Heading3"/>
@@ -3349,8 +3658,8 @@
         <w:t xml:space="preserve">More materials will be added as the semester progresses!</w:t>
       </w:r>
     </w:p>
-    <w:bookmarkEnd w:id="101"/>
-    <w:bookmarkStart w:id="102" w:name="opening-notebooks-in-vs-code"/>
+    <w:bookmarkEnd w:id="116"/>
+    <w:bookmarkStart w:id="117" w:name="opening-notebooks-in-vs-code"/>
     <w:p>
       <w:pPr>
         <w:pStyle w:val="Heading3"/>
@@ -3654,8 +3963,8 @@
         <w:t xml:space="preserve">Choose your Python 3.10+ environment</w:t>
       </w:r>
     </w:p>
-    <w:bookmarkEnd w:id="102"/>
-    <w:bookmarkStart w:id="106" w:name="helpful-resources"/>
+    <w:bookmarkEnd w:id="117"/>
+    <w:bookmarkStart w:id="121" w:name="helpful-resources"/>
     <w:p>
       <w:pPr>
         <w:pStyle w:val="Heading3"/>
@@ -3672,7 +3981,7 @@
           <w:numId w:val="1015"/>
         </w:numPr>
       </w:pPr>
-      <w:hyperlink r:id="rId103">
+      <w:hyperlink r:id="rId118">
         <w:r>
           <w:rPr>
             <w:rStyle w:val="Hyperlink"/>
@@ -3697,7 +4006,7 @@
           <w:numId w:val="1015"/>
         </w:numPr>
       </w:pPr>
-      <w:hyperlink r:id="rId104">
+      <w:hyperlink r:id="rId119">
         <w:r>
           <w:rPr>
             <w:rStyle w:val="Hyperlink"/>
@@ -3722,7 +4031,7 @@
           <w:numId w:val="1015"/>
         </w:numPr>
       </w:pPr>
-      <w:hyperlink r:id="rId105">
+      <w:hyperlink r:id="rId120">
         <w:r>
           <w:rPr>
             <w:rStyle w:val="Hyperlink"/>
@@ -3739,8 +4048,8 @@
         <w:t xml:space="preserve">- VS Code Python features</w:t>
       </w:r>
     </w:p>
-    <w:bookmarkEnd w:id="106"/>
-    <w:bookmarkStart w:id="107" w:name="X56345875830f1339866adc183aca910cf8dc684"/>
+    <w:bookmarkEnd w:id="121"/>
+    <w:bookmarkStart w:id="122" w:name="X56345875830f1339866adc183aca910cf8dc684"/>
     <w:p>
       <w:pPr>
         <w:pStyle w:val="Heading3"/>
@@ -3852,9 +4161,9 @@
         <w:t xml:space="preserve">: VS Code’s notebook support is excellent for keeping everything in one place alongside your Python files!</w:t>
       </w:r>
     </w:p>
-    <w:bookmarkEnd w:id="107"/>
-    <w:bookmarkEnd w:id="108"/>
-    <w:bookmarkStart w:id="109" w:name="our-ai-policy-a-quick-reminder"/>
+    <w:bookmarkEnd w:id="122"/>
+    <w:bookmarkEnd w:id="123"/>
+    <w:bookmarkStart w:id="124" w:name="our-ai-policy-a-quick-reminder"/>
     <w:p>
       <w:pPr>
         <w:pStyle w:val="Heading2"/>
@@ -3971,8 +4280,8 @@
         <w:t xml:space="preserve">In your final project, your team will be required to document how you used AI tools in your development process.</w:t>
       </w:r>
     </w:p>
-    <w:bookmarkEnd w:id="109"/>
-    <w:bookmarkStart w:id="115" w:name="how-grading-works"/>
+    <w:bookmarkEnd w:id="124"/>
+    <w:bookmarkStart w:id="130" w:name="how-grading-works"/>
     <w:p>
       <w:pPr>
         <w:pStyle w:val="Heading2"/>
@@ -4005,7 +4314,7 @@
         <w:t xml:space="preserve">that provides you with immediate, detailed feedback on your lab submissions. Here’s what to expect:</w:t>
       </w:r>
     </w:p>
-    <w:bookmarkStart w:id="111" w:name="automatic-assessment"/>
+    <w:bookmarkStart w:id="126" w:name="automatic-assessment"/>
     <w:p>
       <w:pPr>
         <w:pStyle w:val="Heading3"/>
@@ -4032,7 +4341,7 @@
       <w:r>
         <w:t xml:space="preserve"> </w:t>
       </w:r>
-      <w:hyperlink r:id="rId110">
+      <w:hyperlink r:id="rId125">
         <w:r>
           <w:rPr>
             <w:rStyle w:val="Hyperlink"/>
@@ -4071,8 +4380,8 @@
         <w:t xml:space="preserve">Scoring is objective and consistent across all students</w:t>
       </w:r>
     </w:p>
-    <w:bookmarkEnd w:id="111"/>
-    <w:bookmarkStart w:id="112" w:name="github-issues-feedback"/>
+    <w:bookmarkEnd w:id="126"/>
+    <w:bookmarkStart w:id="127" w:name="github-issues-feedback"/>
     <w:p>
       <w:pPr>
         <w:pStyle w:val="Heading3"/>
@@ -4197,8 +4506,8 @@
         <w:t xml:space="preserve">- For code labs, see which functions pass/fail automated tests</w:t>
       </w:r>
     </w:p>
-    <w:bookmarkEnd w:id="112"/>
-    <w:bookmarkStart w:id="113" w:name="what-this-means-for-you"/>
+    <w:bookmarkEnd w:id="127"/>
+    <w:bookmarkStart w:id="128" w:name="what-this-means-for-you"/>
     <w:p>
       <w:pPr>
         <w:pStyle w:val="Heading3"/>
@@ -4299,8 +4608,8 @@
         <w:t xml:space="preserve">- Automated grading frees up office hours for higher-level concept discussion</w:t>
       </w:r>
     </w:p>
-    <w:bookmarkEnd w:id="113"/>
-    <w:bookmarkStart w:id="114" w:name="example-feedback"/>
+    <w:bookmarkEnd w:id="128"/>
+    <w:bookmarkStart w:id="129" w:name="example-feedback"/>
     <w:p>
       <w:pPr>
         <w:pStyle w:val="Heading3"/>
@@ -4381,9 +4690,9 @@
         <w:t xml:space="preserve">: Students with perfect scores (10/10) won’t receive feedback issues since no improvements are needed!</w:t>
       </w:r>
     </w:p>
-    <w:bookmarkEnd w:id="114"/>
-    <w:bookmarkEnd w:id="115"/>
-    <w:bookmarkStart w:id="116" w:name="getting-help"/>
+    <w:bookmarkEnd w:id="129"/>
+    <w:bookmarkEnd w:id="130"/>
+    <w:bookmarkStart w:id="131" w:name="getting-help"/>
     <w:p>
       <w:pPr>
         <w:pStyle w:val="Heading2"/>
@@ -4471,8 +4780,8 @@
         <w:t xml:space="preserve">- Automated feedback often answers common questions about your submission.</w:t>
       </w:r>
     </w:p>
-    <w:bookmarkEnd w:id="116"/>
-    <w:bookmarkStart w:id="147" w:name="additional-resources"/>
+    <w:bookmarkEnd w:id="131"/>
+    <w:bookmarkStart w:id="162" w:name="additional-resources"/>
     <w:p>
       <w:pPr>
         <w:pStyle w:val="Heading2"/>
@@ -4489,7 +4798,7 @@
         <w:t xml:space="preserve">This section provides essential tools and resources to support your learning journey in IS4010, from interactive coding environments to AI assistants.</w:t>
       </w:r>
     </w:p>
-    <w:bookmarkStart w:id="125" w:name="interactive-learning-tools"/>
+    <w:bookmarkStart w:id="140" w:name="interactive-learning-tools"/>
     <w:p>
       <w:pPr>
         <w:pStyle w:val="Heading3"/>
@@ -4498,7 +4807,7 @@
         <w:t xml:space="preserve">🔬 Interactive learning tools</w:t>
       </w:r>
     </w:p>
-    <w:bookmarkStart w:id="120" w:name="jupyter-notebooks"/>
+    <w:bookmarkStart w:id="135" w:name="jupyter-notebooks"/>
     <w:p>
       <w:pPr>
         <w:pStyle w:val="Heading4"/>
@@ -4539,7 +4848,7 @@
           <w:numId w:val="1020"/>
         </w:numPr>
       </w:pPr>
-      <w:hyperlink r:id="rId117">
+      <w:hyperlink r:id="rId132">
         <w:r>
           <w:rPr>
             <w:rStyle w:val="Hyperlink"/>
@@ -4564,7 +4873,7 @@
           <w:numId w:val="1020"/>
         </w:numPr>
       </w:pPr>
-      <w:hyperlink r:id="rId118">
+      <w:hyperlink r:id="rId133">
         <w:r>
           <w:rPr>
             <w:rStyle w:val="Hyperlink"/>
@@ -4589,7 +4898,7 @@
           <w:numId w:val="1020"/>
         </w:numPr>
       </w:pPr>
-      <w:hyperlink r:id="rId119">
+      <w:hyperlink r:id="rId134">
         <w:r>
           <w:rPr>
             <w:rStyle w:val="Hyperlink"/>
@@ -4694,8 +5003,8 @@
         <w:t xml:space="preserve">: Some weeks include companion notebooks for hands-on practice</w:t>
       </w:r>
     </w:p>
-    <w:bookmarkEnd w:id="120"/>
-    <w:bookmarkStart w:id="124" w:name="python-learning-resources"/>
+    <w:bookmarkEnd w:id="135"/>
+    <w:bookmarkStart w:id="139" w:name="python-learning-resources"/>
     <w:p>
       <w:pPr>
         <w:pStyle w:val="Heading4"/>
@@ -4712,7 +5021,7 @@
           <w:numId w:val="1021"/>
         </w:numPr>
       </w:pPr>
-      <w:hyperlink r:id="rId121">
+      <w:hyperlink r:id="rId136">
         <w:r>
           <w:rPr>
             <w:rStyle w:val="Hyperlink"/>
@@ -4737,7 +5046,7 @@
           <w:numId w:val="1021"/>
         </w:numPr>
       </w:pPr>
-      <w:hyperlink r:id="rId122">
+      <w:hyperlink r:id="rId137">
         <w:r>
           <w:rPr>
             <w:rStyle w:val="Hyperlink"/>
@@ -4762,7 +5071,7 @@
           <w:numId w:val="1021"/>
         </w:numPr>
       </w:pPr>
-      <w:hyperlink r:id="rId123">
+      <w:hyperlink r:id="rId138">
         <w:r>
           <w:rPr>
             <w:rStyle w:val="Hyperlink"/>
@@ -4779,9 +5088,9 @@
         <w:t xml:space="preserve">- Official Python learning resources</w:t>
       </w:r>
     </w:p>
-    <w:bookmarkEnd w:id="124"/>
-    <w:bookmarkEnd w:id="125"/>
-    <w:bookmarkStart w:id="139" w:name="ai-powered-learning-assistants"/>
+    <w:bookmarkEnd w:id="139"/>
+    <w:bookmarkEnd w:id="140"/>
+    <w:bookmarkStart w:id="154" w:name="ai-powered-learning-assistants"/>
     <w:p>
       <w:pPr>
         <w:pStyle w:val="Heading3"/>
@@ -4991,7 +5300,7 @@
               <w:pStyle w:val="Compact"/>
               <w:jc w:val="left"/>
             </w:pPr>
-            <w:hyperlink r:id="rId126">
+            <w:hyperlink r:id="rId141">
               <w:r>
                 <w:rPr>
                   <w:rStyle w:val="Hyperlink"/>
@@ -5060,7 +5369,7 @@
               <w:pStyle w:val="Compact"/>
               <w:jc w:val="left"/>
             </w:pPr>
-            <w:hyperlink r:id="rId127">
+            <w:hyperlink r:id="rId142">
               <w:r>
                 <w:rPr>
                   <w:rStyle w:val="Hyperlink"/>
@@ -5129,7 +5438,7 @@
               <w:pStyle w:val="Compact"/>
               <w:jc w:val="left"/>
             </w:pPr>
-            <w:hyperlink r:id="rId128">
+            <w:hyperlink r:id="rId143">
               <w:r>
                 <w:rPr>
                   <w:rStyle w:val="Hyperlink"/>
@@ -5198,7 +5507,7 @@
               <w:pStyle w:val="Compact"/>
               <w:jc w:val="left"/>
             </w:pPr>
-            <w:hyperlink r:id="rId129">
+            <w:hyperlink r:id="rId144">
               <w:r>
                 <w:rPr>
                   <w:rStyle w:val="Hyperlink"/>
@@ -5267,7 +5576,7 @@
               <w:pStyle w:val="Compact"/>
               <w:jc w:val="left"/>
             </w:pPr>
-            <w:hyperlink r:id="rId130">
+            <w:hyperlink r:id="rId145">
               <w:r>
                 <w:rPr>
                   <w:rStyle w:val="Hyperlink"/>
@@ -5336,7 +5645,7 @@
               <w:pStyle w:val="Compact"/>
               <w:jc w:val="left"/>
             </w:pPr>
-            <w:hyperlink r:id="rId131">
+            <w:hyperlink r:id="rId146">
               <w:r>
                 <w:rPr>
                   <w:rStyle w:val="Hyperlink"/>
@@ -5405,7 +5714,7 @@
               <w:pStyle w:val="Compact"/>
               <w:jc w:val="left"/>
             </w:pPr>
-            <w:hyperlink r:id="rId132">
+            <w:hyperlink r:id="rId147">
               <w:r>
                 <w:rPr>
                   <w:rStyle w:val="Hyperlink"/>
@@ -5474,7 +5783,7 @@
               <w:pStyle w:val="Compact"/>
               <w:jc w:val="left"/>
             </w:pPr>
-            <w:hyperlink r:id="rId133">
+            <w:hyperlink r:id="rId148">
               <w:r>
                 <w:rPr>
                   <w:rStyle w:val="Hyperlink"/>
@@ -5543,7 +5852,7 @@
               <w:pStyle w:val="Compact"/>
               <w:jc w:val="left"/>
             </w:pPr>
-            <w:hyperlink r:id="rId134">
+            <w:hyperlink r:id="rId149">
               <w:r>
                 <w:rPr>
                   <w:rStyle w:val="Hyperlink"/>
@@ -5612,7 +5921,7 @@
               <w:pStyle w:val="Compact"/>
               <w:jc w:val="left"/>
             </w:pPr>
-            <w:hyperlink r:id="rId135">
+            <w:hyperlink r:id="rId150">
               <w:r>
                 <w:rPr>
                   <w:rStyle w:val="Hyperlink"/>
@@ -5681,7 +5990,7 @@
               <w:pStyle w:val="Compact"/>
               <w:jc w:val="left"/>
             </w:pPr>
-            <w:hyperlink r:id="rId136">
+            <w:hyperlink r:id="rId151">
               <w:r>
                 <w:rPr>
                   <w:rStyle w:val="Hyperlink"/>
@@ -5743,7 +6052,7 @@
         </w:tc>
       </w:tr>
     </w:tbl>
-    <w:bookmarkStart w:id="137" w:name="effective-ai-prompting-for-is4010"/>
+    <w:bookmarkStart w:id="152" w:name="effective-ai-prompting-for-is4010"/>
     <w:p>
       <w:pPr>
         <w:pStyle w:val="Heading4"/>
@@ -5857,8 +6166,8 @@
         <w:t xml:space="preserve">Here's what it does: [explain purpose] and here's my code: [paste code]"</w:t>
       </w:r>
     </w:p>
-    <w:bookmarkEnd w:id="137"/>
-    <w:bookmarkStart w:id="138" w:name="ai-tool-recommendations-by-task"/>
+    <w:bookmarkEnd w:id="152"/>
+    <w:bookmarkStart w:id="153" w:name="ai-tool-recommendations-by-task"/>
     <w:p>
       <w:pPr>
         <w:pStyle w:val="Heading4"/>
@@ -5962,9 +6271,9 @@
         <w:t xml:space="preserve">: Any of the above + follow-up questions</w:t>
       </w:r>
     </w:p>
-    <w:bookmarkEnd w:id="138"/>
-    <w:bookmarkEnd w:id="139"/>
-    <w:bookmarkStart w:id="146" w:name="additional-learning-resources"/>
+    <w:bookmarkEnd w:id="153"/>
+    <w:bookmarkEnd w:id="154"/>
+    <w:bookmarkStart w:id="161" w:name="additional-learning-resources"/>
     <w:p>
       <w:pPr>
         <w:pStyle w:val="Heading3"/>
@@ -5973,7 +6282,7 @@
         <w:t xml:space="preserve">🔗 Additional learning resources</w:t>
       </w:r>
     </w:p>
-    <w:bookmarkStart w:id="142" w:name="course-support"/>
+    <w:bookmarkStart w:id="157" w:name="course-support"/>
     <w:p>
       <w:pPr>
         <w:pStyle w:val="Heading4"/>
@@ -6015,7 +6324,7 @@
           <w:numId w:val="1023"/>
         </w:numPr>
       </w:pPr>
-      <w:hyperlink r:id="rId140">
+      <w:hyperlink r:id="rId155">
         <w:r>
           <w:rPr>
             <w:rStyle w:val="Hyperlink"/>
@@ -6040,7 +6349,7 @@
           <w:numId w:val="1023"/>
         </w:numPr>
       </w:pPr>
-      <w:hyperlink r:id="rId141">
+      <w:hyperlink r:id="rId156">
         <w:r>
           <w:rPr>
             <w:rStyle w:val="Hyperlink"/>
@@ -6057,8 +6366,8 @@
         <w:t xml:space="preserve">- Productivity tips for your IDE</w:t>
       </w:r>
     </w:p>
-    <w:bookmarkEnd w:id="142"/>
-    <w:bookmarkStart w:id="145" w:name="computer-science-fundamentals"/>
+    <w:bookmarkEnd w:id="157"/>
+    <w:bookmarkStart w:id="160" w:name="computer-science-fundamentals"/>
     <w:p>
       <w:pPr>
         <w:pStyle w:val="Heading4"/>
@@ -6075,7 +6384,7 @@
           <w:numId w:val="1024"/>
         </w:numPr>
       </w:pPr>
-      <w:hyperlink r:id="rId143">
+      <w:hyperlink r:id="rId158">
         <w:r>
           <w:rPr>
             <w:rStyle w:val="Hyperlink"/>
@@ -6100,7 +6409,7 @@
           <w:numId w:val="1024"/>
         </w:numPr>
       </w:pPr>
-      <w:hyperlink r:id="rId144">
+      <w:hyperlink r:id="rId159">
         <w:r>
           <w:rPr>
             <w:rStyle w:val="Hyperlink"/>
@@ -6135,10 +6444,10 @@
         <w:t xml:space="preserve">This list is not exhaustive and was last updated on September 18, 2025. The free tiers and features of these services are subject to change. Please refer to the official websites for the most current information.</w:t>
       </w:r>
     </w:p>
-    <w:bookmarkEnd w:id="145"/>
-    <w:bookmarkEnd w:id="146"/>
-    <w:bookmarkEnd w:id="147"/>
-    <w:bookmarkEnd w:id="148"/>
+    <w:bookmarkEnd w:id="160"/>
+    <w:bookmarkEnd w:id="161"/>
+    <w:bookmarkEnd w:id="162"/>
+    <w:bookmarkEnd w:id="163"/>
     <w:sectPr>
       <w:footnotePr>
         <w:numRestart w:val="eachSect"/>

</xml_diff>